<commit_message>
ICEEL EL2036: corrected version ready to attach (9 pages)
- build_from_template.py: strip manual heading numbers, since the
  template's heading styles number themselves (the submitted version
  showed "1 1 INTRODUCTION"); drop two Section 3.3 sentences that
  repeated Sections 1 and 4.2.
- correction/: EL2036_Tokiwa_corrected.docx (copy of full_paper.docx)
  and EL2036_changes.docx for the email; the email is now a follow-up
  that attaches them.
- build_correction_docx.py takes optional SRC.md OUT.docx arguments so
  the ICEEL change list can reuse it.

Rendered with the template fonts (Linux Libertine O / Biolinum O), the
corrected paper is 9 pages; the submitted version was 8.

Co-Authored-By: Claude Opus 5.5 <noreply@anthropic.com>
Claude-Session: https://claude.ai/code/session_01PtLTEUN6Kmos91FTvxtXLu
</commit_message>
<xml_diff>
--- a/metaanalysis/conference_submissions/iceel/full_paper.docx
+++ b/metaanalysis/conference_submissions/iceel/full_paper.docx
@@ -89,7 +89,7 @@
         <w:pStyle w:val="Head1"/>
       </w:pPr>
       <w:r>
-        <w:t>1 INTRODUCTION</w:t>
+        <w:t>INTRODUCTION</w:t>
       </w:r>
     </w:p>
     <w:p>
@@ -113,7 +113,7 @@
         <w:pStyle w:val="Head1"/>
       </w:pPr>
       <w:r>
-        <w:t>2 RELATED WORK</w:t>
+        <w:t>RELATED WORK</w:t>
       </w:r>
     </w:p>
     <w:p>
@@ -121,7 +121,7 @@
         <w:pStyle w:val="Head2"/>
       </w:pPr>
       <w:r>
-        <w:t>2.1 Hofstede's framework, Big Five linkages, and educational implications</w:t>
+        <w:t>Hofstede's framework, Big Five linkages, and educational implications</w:t>
       </w:r>
     </w:p>
     <w:p>
@@ -153,7 +153,7 @@
         <w:pStyle w:val="Head2"/>
       </w:pPr>
       <w:r>
-        <w:t>2.2 East Asian samples in personality – academic-achievement research</w:t>
+        <w:t>East Asian samples in personality – academic-achievement research</w:t>
       </w:r>
     </w:p>
     <w:p>
@@ -169,7 +169,7 @@
         <w:pStyle w:val="Head2"/>
       </w:pPr>
       <w:r>
-        <w:t>2.3 Japanese online learning context</w:t>
+        <w:t>Japanese online learning context</w:t>
       </w:r>
     </w:p>
     <w:p>
@@ -185,7 +185,7 @@
         <w:pStyle w:val="Head1"/>
       </w:pPr>
       <w:r>
-        <w:t>3 METHOD</w:t>
+        <w:t>METHOD</w:t>
       </w:r>
     </w:p>
     <w:p>
@@ -193,7 +193,7 @@
         <w:pStyle w:val="Head2"/>
       </w:pPr>
       <w:r>
-        <w:t>3.1 Data</w:t>
+        <w:t>Data</w:t>
       </w:r>
     </w:p>
     <w:p>
@@ -253,7 +253,7 @@
         <w:pStyle w:val="Head2"/>
       </w:pPr>
       <w:r>
-        <w:t>3.2 Hofstede cultural-dimensions table</w:t>
+        <w:t>Hofstede cultural-dimensions table</w:t>
       </w:r>
     </w:p>
     <w:p>
@@ -285,7 +285,7 @@
         <w:pStyle w:val="Head2"/>
       </w:pPr>
       <w:r>
-        <w:t>3.3 Statistical model</w:t>
+        <w:t>Statistical model</w:t>
       </w:r>
     </w:p>
     <w:p>
@@ -293,7 +293,7 @@
         <w:pStyle w:val="PostHeadPara"/>
       </w:pPr>
       <w:r>
-        <w:t>Per trait, REML + HKSJ pooled r is computed on the k = 2 Asian primary-pool studies (back-transformed 95 % CI reported), with τ² estimated by maximising the restricted likelihood. For each (trait, dimension) pair, a 2-parameter weighted-OLS Hofstede meta-regression is fit (weights = 1 / (v + τ²), τ² from REML). Because k = 2, residual df = 0; slopes are computable but no SE / t / p estimable, so slopes are reported as descriptive only. With two studies, each slope is simply the Japan − China difference in Fisher z divided by the Japan − China difference in the dimension score, so the weights do not affect it. The Asia vs non-Asia contrast cited from the parent preprint is re-tested with a mixed-effects meta-regression on a region indicator with the Knapp–Hartung adjustment.</w:t>
+        <w:t>Per trait, REML + HKSJ pooled r is computed on the k = 2 Asian primary-pool studies (back-transformed 95 % CI reported), with τ² estimated by maximising the restricted likelihood. For each (trait, dimension) pair, a 2-parameter weighted-OLS Hofstede meta-regression is fit (weights = 1 / (v + τ²), τ² from REML). Because k = 2, residual df = 0; slopes are computable but no SE / t / p estimable, so slopes are reported as descriptive only.</w:t>
       </w:r>
     </w:p>
     <w:p>
@@ -301,7 +301,7 @@
         <w:pStyle w:val="Head3"/>
       </w:pPr>
       <w:r>
-        <w:t>3.3.1 Japan synthesis.</w:t>
+        <w:t>Japan synthesis.</w:t>
       </w:r>
     </w:p>
     <w:p>
@@ -317,7 +317,7 @@
         <w:pStyle w:val="Head2"/>
       </w:pPr>
       <w:r>
-        <w:t>3.4 Reproducibility</w:t>
+        <w:t>Reproducibility</w:t>
       </w:r>
     </w:p>
     <w:p>
@@ -333,7 +333,7 @@
         <w:pStyle w:val="Head1"/>
       </w:pPr>
       <w:r>
-        <w:t>4 RESULTS</w:t>
+        <w:t>RESULTS</w:t>
       </w:r>
     </w:p>
     <w:p>
@@ -341,7 +341,7 @@
         <w:pStyle w:val="Head2"/>
       </w:pPr>
       <w:r>
-        <w:t>4.1 Asian-subset pooled correlations</w:t>
+        <w:t>Asian-subset pooled correlations</w:t>
       </w:r>
     </w:p>
     <w:p>
@@ -824,7 +824,7 @@
         <w:pStyle w:val="Head2"/>
       </w:pPr>
       <w:r>
-        <w:t>4.2 Hofstede single-dimension meta-regression</w:t>
+        <w:t>Hofstede single-dimension meta-regression</w:t>
       </w:r>
     </w:p>
     <w:p>
@@ -1751,7 +1751,7 @@
         <w:pStyle w:val="Head2"/>
       </w:pPr>
       <w:r>
-        <w:t>4.3 Japan synthesis</w:t>
+        <w:t>Japan synthesis</w:t>
       </w:r>
     </w:p>
     <w:p>
@@ -2334,7 +2334,7 @@
         <w:pStyle w:val="Head2"/>
       </w:pPr>
       <w:r>
-        <w:t>4.4 Hofstede direction-prediction match in Japan studies</w:t>
+        <w:t>Hofstede direction-prediction match in Japan studies</w:t>
       </w:r>
     </w:p>
     <w:p>
@@ -2903,7 +2903,7 @@
         <w:pStyle w:val="Head1"/>
       </w:pPr>
       <w:r>
-        <w:t>5 DISCUSSION</w:t>
+        <w:t>DISCUSSION</w:t>
       </w:r>
     </w:p>
     <w:p>
@@ -2911,7 +2911,7 @@
         <w:pStyle w:val="Head2"/>
       </w:pPr>
       <w:r>
-        <w:t>5.1 The within-Asia evidence problem</w:t>
+        <w:t>The within-Asia evidence problem</w:t>
       </w:r>
     </w:p>
     <w:p>
@@ -2927,7 +2927,7 @@
         <w:pStyle w:val="Head2"/>
       </w:pPr>
       <w:r>
-        <w:t>5.2 What the Hofstede slopes can and cannot show</w:t>
+        <w:t>What the Hofstede slopes can and cannot show</w:t>
       </w:r>
     </w:p>
     <w:p>
@@ -2943,7 +2943,7 @@
         <w:pStyle w:val="Head2"/>
       </w:pPr>
       <w:r>
-        <w:t>5.3 The Japan instrument problem</w:t>
+        <w:t>The Japan instrument problem</w:t>
       </w:r>
     </w:p>
     <w:p>
@@ -2959,7 +2959,7 @@
         <w:pStyle w:val="Head2"/>
       </w:pPr>
       <w:r>
-        <w:t>5.4 The Hofstede direction-match in Japan</w:t>
+        <w:t>The Hofstede direction-match in Japan</w:t>
       </w:r>
     </w:p>
     <w:p>
@@ -2975,7 +2975,7 @@
         <w:pStyle w:val="Head2"/>
       </w:pPr>
       <w:r>
-        <w:t>5.5 Self-plagiarism firewall</w:t>
+        <w:t>Self-plagiarism firewall</w:t>
       </w:r>
     </w:p>
     <w:p>
@@ -2991,7 +2991,7 @@
         <w:pStyle w:val="Head1"/>
       </w:pPr>
       <w:r>
-        <w:t>6 LIMITATIONS</w:t>
+        <w:t>LIMITATIONS</w:t>
       </w:r>
     </w:p>
     <w:p>
@@ -3007,7 +3007,7 @@
         <w:pStyle w:val="Head1"/>
       </w:pPr>
       <w:r>
-        <w:t>7 CONCLUSION</w:t>
+        <w:t>CONCLUSION</w:t>
       </w:r>
     </w:p>
     <w:p>

</xml_diff>